<commit_message>
Refactor about.html introduction for improved readability, enhance cursor visibility and behavior in cursor.js, and optimize CSS for better layout and responsiveness across various components. Update project navigation logic in components.js to exclude playground projects from the next projects list.
</commit_message>
<xml_diff>
--- a/assets/img/Resume.docx
+++ b/assets/img/Resume.docx
@@ -6,6 +6,9 @@
       <w:pPr>
         <w:spacing w:after="120" w:line="240" w:lineRule="auto"/>
         <w:jc w:val="center"/>
+        <w:rPr>
+          <w:lang w:val="de-DE"/>
+        </w:rPr>
       </w:pPr>
       <w:r>
         <w:rPr>
@@ -154,7 +157,7 @@
           <w:i/>
           <w:iCs/>
         </w:rPr>
-        <w:t xml:space="preserve"> – </w:t>
+        <w:t xml:space="preserve"> –</w:t>
       </w:r>
       <w:r>
         <w:rPr>
@@ -163,7 +166,7 @@
           <w:i/>
           <w:iCs/>
         </w:rPr>
-        <w:t>Present</w:t>
+        <w:t>May 2026</w:t>
       </w:r>
       <w:r>
         <w:br/>
@@ -868,14 +871,10 @@
       </w:r>
       <w:r>
         <w:br/>
-      </w:r>
-      <w:r>
         <w:t>Web Development: WordPress, Drupal, HTML5, CSS3, Responsive Development</w:t>
       </w:r>
       <w:r>
         <w:br/>
-      </w:r>
-      <w:r>
         <w:t>Tools: Figma, Illustrator, VS Code, AI-assisted development tools</w:t>
       </w:r>
     </w:p>
@@ -897,7 +896,7 @@
     <w:p>
       <w:pPr>
         <w:tabs>
-          <w:tab w:val="center" w:pos="9923"/>
+          <w:tab w:val="center" w:pos="10773"/>
         </w:tabs>
         <w:spacing w:after="120" w:line="240" w:lineRule="auto"/>
       </w:pPr>
@@ -927,7 +926,16 @@
           <w:i/>
           <w:iCs/>
         </w:rPr>
-        <w:t>Expected September 2026</w:t>
+        <w:t>May</w:t>
+      </w:r>
+      <w:r>
+        <w:rPr>
+          <w:b/>
+          <w:bCs/>
+          <w:i/>
+          <w:iCs/>
+        </w:rPr>
+        <w:t xml:space="preserve"> 2026</w:t>
       </w:r>
       <w:r>
         <w:br/>
@@ -1017,17 +1025,7 @@
           <w:szCs w:val="20"/>
           <w:shd w:val="clear" w:color="auto" w:fill="FFFFFF"/>
         </w:rPr>
-        <w:t>People's Choice Award</w:t>
-      </w:r>
-      <w:r>
-        <w:rPr>
-          <w:rFonts w:cs="Arial"/>
-          <w:b/>
-          <w:bCs/>
-          <w:szCs w:val="20"/>
-          <w:shd w:val="clear" w:color="auto" w:fill="FFFFFF"/>
-        </w:rPr>
-        <w:t xml:space="preserve"> at</w:t>
+        <w:t>People's Choice Award at</w:t>
       </w:r>
       <w:r>
         <w:rPr>
@@ -1070,15 +1068,7 @@
           <w:color w:val="7F7F7F" w:themeColor="text1" w:themeTint="80"/>
           <w:szCs w:val="20"/>
         </w:rPr>
-        <w:t>ASU</w:t>
-      </w:r>
-      <w:r>
-        <w:rPr>
-          <w:rFonts w:cs="Arial"/>
-          <w:color w:val="7F7F7F" w:themeColor="text1" w:themeTint="80"/>
-          <w:szCs w:val="20"/>
-        </w:rPr>
-        <w:t xml:space="preserve"> and Endless Games and Learning Lab</w:t>
+        <w:t>ASU and Endless Games and Learning Lab</w:t>
       </w:r>
       <w:r>
         <w:rPr>
@@ -1145,13 +1135,7 @@
         <w:t>IRB – Social and Behavioral Research (Group 2)</w:t>
       </w:r>
       <w:r>
-        <w:t xml:space="preserve"> </w:t>
-      </w:r>
-      <w:r>
-        <w:t>–</w:t>
-      </w:r>
-      <w:r>
-        <w:t xml:space="preserve"> </w:t>
+        <w:t xml:space="preserve"> – </w:t>
       </w:r>
       <w:r>
         <w:t>CITI Program</w:t>

</xml_diff>